<commit_message>
CN Notes: review pass on M09-M11 (all verified; 2 wording nits fixed)
Three audits verified M09-M11: DNS/HTTP/email/DHCP ports & semantics, crypto
directions (sign with private key), TLS handshake, firewall/IDS/IPS/VPN, CSMA/CA,
hidden terminal/RTS-CTS, cellular gens, WPA - all correct. Fixes:
- M10 §10.2: Diffie-Hellman shown as separate key-exchange (DH/ECDH), not under ECC.
- M09 §9.3: HTTP 'text-based' qualified to HTTP/1.x (binary-framed in HTTP/2 & 3).
</commit_message>
<xml_diff>
--- a/SITP/CN/Notes/M09_Application_Layer.docx
+++ b/SITP/CN/Notes/M09_Application_Layer.docx
@@ -1493,13 +1493,41 @@
           <w:b/>
           <w:bCs/>
         </w:rPr>
-        <w:t xml:space="preserve">stateless, text-based request/response</w:t>
-      </w:r>
-      <w:r>
-        <w:t xml:space="preserve"> </w:t>
-      </w:r>
-      <w:r>
-        <w:t xml:space="preserve">protocol over</w:t>
+        <w:t xml:space="preserve">stateless request/response</w:t>
+      </w:r>
+      <w:r>
+        <w:t xml:space="preserve"> </w:t>
+      </w:r>
+      <w:r>
+        <w:t xml:space="preserve">protocol</w:t>
+      </w:r>
+      <w:r>
+        <w:t xml:space="preserve"> </w:t>
+      </w:r>
+      <w:r>
+        <w:t xml:space="preserve">(text-based in HTTP/1.x;</w:t>
+      </w:r>
+      <w:r>
+        <w:t xml:space="preserve"> </w:t>
+      </w:r>
+      <w:r>
+        <w:rPr>
+          <w:b/>
+          <w:bCs/>
+        </w:rPr>
+        <w:t xml:space="preserve">binary-framed</w:t>
+      </w:r>
+      <w:r>
+        <w:t xml:space="preserve"> </w:t>
+      </w:r>
+      <w:r>
+        <w:t xml:space="preserve">in HTTP/2 and HTTP/3)</w:t>
+      </w:r>
+      <w:r>
+        <w:t xml:space="preserve"> </w:t>
+      </w:r>
+      <w:r>
+        <w:t xml:space="preserve">over</w:t>
       </w:r>
       <w:r>
         <w:t xml:space="preserve"> </w:t>

</xml_diff>